<commit_message>
Supplement Table S9: note on Egger intercept P value source; integer SNP counts
</commit_message>
<xml_diff>
--- a/results/manuscript_v2/RC_NAFLD_MR_supplementary_v2.docx
+++ b/results/manuscript_v2/RC_NAFLD_MR_supplementary_v2.docx
@@ -30440,7 +30440,7 @@
                 <w:rFonts w:ascii="Times New Roman" w:hAnsi="Times New Roman"/>
                 <w:sz w:val="16"/>
               </w:rPr>
-              <w:t>48.0</w:t>
+              <w:t>48</w:t>
             </w:r>
           </w:p>
         </w:tc>
@@ -30613,7 +30613,7 @@
                 <w:rFonts w:ascii="Times New Roman" w:hAnsi="Times New Roman"/>
                 <w:sz w:val="16"/>
               </w:rPr>
-              <w:t>51.0</w:t>
+              <w:t>51</w:t>
             </w:r>
           </w:p>
         </w:tc>
@@ -30792,7 +30792,7 @@
                 <w:rFonts w:ascii="Times New Roman" w:hAnsi="Times New Roman"/>
                 <w:sz w:val="16"/>
               </w:rPr>
-              <w:t>48.0</w:t>
+              <w:t>48</w:t>
             </w:r>
           </w:p>
         </w:tc>
@@ -30962,7 +30962,7 @@
           <w:rFonts w:ascii="Times New Roman" w:hAnsi="Times New Roman"/>
           <w:sz w:val="16"/>
         </w:rPr>
-        <w:t>φ = multiplicative random-effects residual standard error (values above 1 indicate overdispersion).</w:t>
+        <w:t>φ = multiplicative random-effects residual standard error (values above 1 indicate overdispersion). These values come from the R run (MendelianRandomization package), which tests the Egger intercept against a normal distribution; Table 3 gives the t-distribution P values from the primary analysis (.261, .118 and .952). The conclusion is the same.</w:t>
       </w:r>
     </w:p>
     <w:p>

</xml_diff>